<commit_message>
Enhance simulation engine with flow control and routing improvements
- Introduced flow control parameters in SimulationBridge to manage buffer capacity, reorder points, and batch processing.
- Updated NetworkSimulationEngine to handle flow control signals, blocked packets, and link failures separately.
- Implemented a reachability algorithm to ensure packets are routed only through operational links.
- Enhanced the Hungarian assignment algorithm to respect feasibility conditions for packet-link pairs.
- Added metrics tracking for blocked packets and link failures to provide better insights into simulation performance.
- Improved unit tests to validate flow control behavior, routing decisions, and metrics accuracy.
</commit_message>
<xml_diff>
--- a/informe_tecnico.docx
+++ b/informe_tecnico.docx
@@ -221,14 +221,14 @@
     </w:p>
     <w:p>
       <w:r>
-        <w:t>• Política de Reabastecimiento / Control de Flujo (s, Q): El nodo monitorea permanentemente su nivel de inventario (buffer). Cuando la ocupación desciende por debajo o igual al umbral mínimo s (reorder point), se activa una bandera de control de flujo para solicitar o habilitar la admisión de un lote de tamaño Q, impidiendo la inanición del servidor.</w:t>
+        <w:t>• Política de Reabastecimiento / Control de Flujo (s, Q): El nodo monitorea permanentemente su nivel de inventario (buffer). Cuando la ocupación desciende hasta o por debajo del umbral mínimo s (reorder point) y el lote vigente ya se consumió, el nodo emite la señal de control de flujo y autoriza un nuevo lote de Q paquetes, es decir, libera su canal de entrada. El lote es efectivo, no meramente indicativo: cada admisión consume una unidad del lote y, mientras el saldo esté agotado y la ocupación siga por encima de s, el canal permanece cerrado y el nodo ejerce contrapresión (backpressure) sobre sus vecinos aguas arriba, que retienen el paquete en su propio buffer en lugar de reenviarlo. Este mecanismo anticipa el desbordamiento: el tráfico excedente se rechaza de forma controlada antes de que la cola alcance la capacidad S.</w:t>
         <w:br/>
         <w:br/>
         <w:t>• Modelo de Costos Dinámicos:</w:t>
         <w:br/>
         <w:t xml:space="preserve">  - Costo de Mantener (Holding Cost, H): Representa el costo energético, retención de memoria y latencia impuesta. Se acumula integralmente de forma continua: Costo_Almacenamiento = H · ∫[0 a T] Nq(t) dt = H · Lq · T.</w:t>
         <w:br/>
-        <w:t xml:space="preserve">  - Costo de Ruptura (Shortage Cost, c_s): Penalización monetaria fija asignada a cada paquete descartado por overflow: Costo_Ruptura = N_loss · c_s.</w:t>
+        <w:t xml:space="preserve">  - Costo de Ruptura (Shortage Cost, c_s): Penalización monetaria fija asignada a cada paquete perdido, tanto por desbordamiento de buffer como por rechazo del control de flujo: Costo_Ruptura = (N_loss + N_bloqueados) · c_s.</w:t>
         <w:br/>
         <w:t xml:space="preserve">  - Costo Global del Sistema: Función objetivo a minimizar: Costo_Global = Costo_Almacenamiento + Costo_Ruptura.</w:t>
       </w:r>
@@ -246,7 +246,12 @@
     </w:p>
     <w:p>
       <w:r>
-        <w:t>En redes dinámicas, la asignación estática de rutas induce cuellos de botella severos. En el simulador, en intervalos discretos Δt = 0.5 s, el sistema recolecta N paquetes pendientes de asignación en los nodos de ingreso y M enlaces de transmisión disponibles hacia la capa de conmutación central.</w:t>
+        <w:t>En redes dinámicas, la asignación estática de rutas induce cuellos de botella severos. En el simulador, en intervalos discretos Δt = 0.1 s (del orden del tiempo de servicio 1/μ, para que la asignación no caduque antes de ser utilizada), el sistema plantea un único problema global: los N paquetes que están en cabeza de cola en todos los routers -los únicos que el nodo alcanza a despachar dentro de Δt- frente a los M enlaces de transmisión operativos de toda la topología. Cada asignación queda vigente exactamente durante Δt; vencida esa ventana el nodo vuelve a decidir por costo mínimo, porque la fotografía de saturación con la que se resolvió la matriz ya no describe la red.</w:t>
+      </w:r>
+    </w:p>
+    <w:p>
+      <w:r>
+        <w:t>Los pares paquete-enlace no admisibles (enlace que no nace del router donde espera el paquete, ruta desde la que su nodo destino ya no es alcanzable, o vecino con el canal de entrada cerrado por la política (s, Q)) se penalizan con el costo ficticio y quedan excluidos de la solución.</w:t>
       </w:r>
     </w:p>
     <w:p>
@@ -506,7 +511,7 @@
                 <w:b/>
                 <w:sz w:val="20"/>
               </w:rPr>
-              <w:t>117.3 segundos</w:t>
+              <w:t>120.0 segundos</w:t>
             </w:r>
           </w:p>
         </w:tc>
@@ -549,7 +554,7 @@
                 <w:b/>
                 <w:sz w:val="20"/>
               </w:rPr>
-              <w:t>5.0 paquetes/s</w:t>
+              <w:t>30.0 paquetes/s</w:t>
             </w:r>
           </w:p>
         </w:tc>
@@ -743,7 +748,7 @@
               <w:rPr>
                 <w:sz w:val="20"/>
               </w:rPr>
-              <w:t>Paquetes Procesados con Éxito (N_proc)</w:t>
+              <w:t>Lotes Q Autorizados (señales s, Q)</w:t>
             </w:r>
           </w:p>
         </w:tc>
@@ -764,7 +769,7 @@
                 <w:b/>
                 <w:sz w:val="20"/>
               </w:rPr>
-              <w:t>2820</w:t>
+              <w:t>569</w:t>
             </w:r>
           </w:p>
         </w:tc>
@@ -786,7 +791,7 @@
               <w:rPr>
                 <w:sz w:val="20"/>
               </w:rPr>
-              <w:t>Paquetes Descartados por Desbordamiento (N_loss)</w:t>
+              <w:t>Paquetes Procesados con Éxito (N_proc)</w:t>
             </w:r>
           </w:p>
         </w:tc>
@@ -807,7 +812,7 @@
                 <w:b/>
                 <w:sz w:val="20"/>
               </w:rPr>
-              <w:t>2481</w:t>
+              <w:t>3516</w:t>
             </w:r>
           </w:p>
         </w:tc>
@@ -829,7 +834,7 @@
               <w:rPr>
                 <w:sz w:val="20"/>
               </w:rPr>
-              <w:t>Tasa Porcentual de Pérdida de Paquetes</w:t>
+              <w:t>Paquetes Descartados por Desbordamiento (N_loss)</w:t>
             </w:r>
           </w:p>
         </w:tc>
@@ -850,7 +855,7 @@
                 <w:b/>
                 <w:sz w:val="20"/>
               </w:rPr>
-              <w:t>46.79%</w:t>
+              <w:t>0</w:t>
             </w:r>
           </w:p>
         </w:tc>
@@ -872,7 +877,7 @@
               <w:rPr>
                 <w:sz w:val="20"/>
               </w:rPr>
-              <w:t>Tiempo Medio de Espera en Cola (Wq)</w:t>
+              <w:t>Paquetes Bloqueados por Control de Flujo</w:t>
             </w:r>
           </w:p>
         </w:tc>
@@ -893,7 +898,7 @@
                 <w:b/>
                 <w:sz w:val="20"/>
               </w:rPr>
-              <w:t>2.172 segundos</w:t>
+              <w:t>117</w:t>
             </w:r>
           </w:p>
         </w:tc>
@@ -915,7 +920,7 @@
               <w:rPr>
                 <w:sz w:val="20"/>
               </w:rPr>
-              <w:t>Tiempo Medio Total en la Red (W)</w:t>
+              <w:t>Paquetes Perdidos por Caída de Enlace</w:t>
             </w:r>
           </w:p>
         </w:tc>
@@ -936,7 +941,7 @@
                 <w:b/>
                 <w:sz w:val="20"/>
               </w:rPr>
-              <w:t>2.319 segundos</w:t>
+              <w:t>0</w:t>
             </w:r>
           </w:p>
         </w:tc>
@@ -958,7 +963,7 @@
               <w:rPr>
                 <w:sz w:val="20"/>
               </w:rPr>
-              <w:t>Número Medio de Paquetes en Cola (Lq)</w:t>
+              <w:t>Tasa Porcentual de Pérdida de Paquetes</w:t>
             </w:r>
           </w:p>
         </w:tc>
@@ -979,7 +984,7 @@
                 <w:b/>
                 <w:sz w:val="20"/>
               </w:rPr>
-              <w:t>52.23 paquetes</w:t>
+              <w:t>3.20%</w:t>
             </w:r>
           </w:p>
         </w:tc>
@@ -1001,7 +1006,7 @@
               <w:rPr>
                 <w:sz w:val="20"/>
               </w:rPr>
-              <w:t>Número Medio de Paquetes en Sistema (L)</w:t>
+              <w:t>Tiempo Medio de Espera en Cola (Wq)</w:t>
             </w:r>
           </w:p>
         </w:tc>
@@ -1022,7 +1027,7 @@
                 <w:b/>
                 <w:sz w:val="20"/>
               </w:rPr>
-              <w:t>55.75 paquetes</w:t>
+              <w:t>0.537 segundos</w:t>
             </w:r>
           </w:p>
         </w:tc>
@@ -1044,7 +1049,7 @@
               <w:rPr>
                 <w:sz w:val="20"/>
               </w:rPr>
-              <w:t>Costo Total de Almacenamiento (Holding Cost)</w:t>
+              <w:t>Tiempo Medio Total en la Red (W)</w:t>
             </w:r>
           </w:p>
         </w:tc>
@@ -1065,7 +1070,7 @@
                 <w:b/>
                 <w:sz w:val="20"/>
               </w:rPr>
-              <w:t>$306.26</w:t>
+              <w:t>0.822 segundos</w:t>
             </w:r>
           </w:p>
         </w:tc>
@@ -1087,7 +1092,7 @@
               <w:rPr>
                 <w:sz w:val="20"/>
               </w:rPr>
-              <w:t>Costo Total de Penalización por Ruptura</w:t>
+              <w:t>Número Medio de Paquetes en Cola (Lq)</w:t>
             </w:r>
           </w:p>
         </w:tc>
@@ -1108,7 +1113,7 @@
                 <w:b/>
                 <w:sz w:val="20"/>
               </w:rPr>
-              <w:t>$24810.00</w:t>
+              <w:t>15.91 paquetes</w:t>
             </w:r>
           </w:p>
         </w:tc>
@@ -1130,7 +1135,7 @@
               <w:rPr>
                 <w:sz w:val="20"/>
               </w:rPr>
-              <w:t>Costo Global del Sistema Consolidado</w:t>
+              <w:t>Número Medio de Paquetes en Sistema (L)</w:t>
             </w:r>
           </w:p>
         </w:tc>
@@ -1151,7 +1156,136 @@
                 <w:b/>
                 <w:sz w:val="20"/>
               </w:rPr>
-              <w:t>$25116.26</w:t>
+              <w:t>24.31 paquetes</w:t>
+            </w:r>
+          </w:p>
+        </w:tc>
+      </w:tr>
+      <w:tr>
+        <w:tc>
+          <w:tcPr>
+            <w:tcW w:type="dxa" w:w="4680"/>
+            <w:shd w:fill="F0F9FF"/>
+            <w:tcMar>
+              <w:top w:w="80" w:type="dxa"/>
+              <w:bottom w:w="80" w:type="dxa"/>
+              <w:left w:w="120" w:type="dxa"/>
+              <w:right w:w="120" w:type="dxa"/>
+            </w:tcMar>
+          </w:tcPr>
+          <w:p>
+            <w:r>
+              <w:rPr>
+                <w:sz w:val="20"/>
+              </w:rPr>
+              <w:t>Costo Total de Almacenamiento (Holding Cost)</w:t>
+            </w:r>
+          </w:p>
+        </w:tc>
+        <w:tc>
+          <w:tcPr>
+            <w:tcW w:type="dxa" w:w="4680"/>
+            <w:shd w:fill="F0F9FF"/>
+            <w:tcMar>
+              <w:top w:w="80" w:type="dxa"/>
+              <w:bottom w:w="80" w:type="dxa"/>
+              <w:left w:w="120" w:type="dxa"/>
+              <w:right w:w="120" w:type="dxa"/>
+            </w:tcMar>
+          </w:tcPr>
+          <w:p>
+            <w:r>
+              <w:rPr>
+                <w:b/>
+                <w:sz w:val="20"/>
+              </w:rPr>
+              <w:t>$95.51</w:t>
+            </w:r>
+          </w:p>
+        </w:tc>
+      </w:tr>
+      <w:tr>
+        <w:tc>
+          <w:tcPr>
+            <w:tcW w:type="dxa" w:w="4680"/>
+            <w:shd w:fill="FFFFFF"/>
+            <w:tcMar>
+              <w:top w:w="80" w:type="dxa"/>
+              <w:bottom w:w="80" w:type="dxa"/>
+              <w:left w:w="120" w:type="dxa"/>
+              <w:right w:w="120" w:type="dxa"/>
+            </w:tcMar>
+          </w:tcPr>
+          <w:p>
+            <w:r>
+              <w:rPr>
+                <w:sz w:val="20"/>
+              </w:rPr>
+              <w:t>Costo Total de Penalización por Ruptura</w:t>
+            </w:r>
+          </w:p>
+        </w:tc>
+        <w:tc>
+          <w:tcPr>
+            <w:tcW w:type="dxa" w:w="4680"/>
+            <w:shd w:fill="FFFFFF"/>
+            <w:tcMar>
+              <w:top w:w="80" w:type="dxa"/>
+              <w:bottom w:w="80" w:type="dxa"/>
+              <w:left w:w="120" w:type="dxa"/>
+              <w:right w:w="120" w:type="dxa"/>
+            </w:tcMar>
+          </w:tcPr>
+          <w:p>
+            <w:r>
+              <w:rPr>
+                <w:b/>
+                <w:sz w:val="20"/>
+              </w:rPr>
+              <w:t>$1170.00</w:t>
+            </w:r>
+          </w:p>
+        </w:tc>
+      </w:tr>
+      <w:tr>
+        <w:tc>
+          <w:tcPr>
+            <w:tcW w:type="dxa" w:w="4680"/>
+            <w:shd w:fill="F0F9FF"/>
+            <w:tcMar>
+              <w:top w:w="80" w:type="dxa"/>
+              <w:bottom w:w="80" w:type="dxa"/>
+              <w:left w:w="120" w:type="dxa"/>
+              <w:right w:w="120" w:type="dxa"/>
+            </w:tcMar>
+          </w:tcPr>
+          <w:p>
+            <w:r>
+              <w:rPr>
+                <w:sz w:val="20"/>
+              </w:rPr>
+              <w:t>Costo Global del Sistema Consolidado</w:t>
+            </w:r>
+          </w:p>
+        </w:tc>
+        <w:tc>
+          <w:tcPr>
+            <w:tcW w:type="dxa" w:w="4680"/>
+            <w:shd w:fill="F0F9FF"/>
+            <w:tcMar>
+              <w:top w:w="80" w:type="dxa"/>
+              <w:bottom w:w="80" w:type="dxa"/>
+              <w:left w:w="120" w:type="dxa"/>
+              <w:right w:w="120" w:type="dxa"/>
+            </w:tcMar>
+          </w:tcPr>
+          <w:p>
+            <w:r>
+              <w:rPr>
+                <w:b/>
+                <w:sz w:val="20"/>
+              </w:rPr>
+              <w:t>$1265.51</w:t>
             </w:r>
           </w:p>
         </w:tc>
@@ -1196,29 +1330,38 @@
         <w:br/>
         <w:t>ANÁLISIS DE RENDIMIENTO Y CONCLUSIONES CUANTITATIVAS:</w:t>
         <w:br/>
-        <w:t>1. Evaluación de Pérdida de Paquetes: CRÍTICO (Severa saturación por desbordamiento de buffer, penalizaciones de costo excesivas).</w:t>
+        <w:t>1. Evaluación de Pérdida de Paquetes: ACEPTABLE (Pérdida moderada dentro de umbrales tolerables para redes IP con QoS estándar).</w:t>
         <w:br/>
-        <w:t xml:space="preserve">   - Se registraron 2481 paquetes descartados por desbordamiento de buffer (tasa de pérdida: 46.79%).</w:t>
+        <w:t xml:space="preserve">   - Tasa de pérdida total: 3.20% del tráfico ofrecido.</w:t>
         <w:br/>
-        <w:t xml:space="preserve">   - El costo por penalización de ruptura asciende a $24810.00, representando el 98.8% del costo global del sistema.</w:t>
+        <w:t xml:space="preserve">   - Desglose por causa: 0 paquetes descartados por desbordamiento de buffer (0.00%), 117 rechazados por la política de control de flujo (s, Q) antes de llegar al desbordamiento y 0 perdidos en tránsito por caída de enlace.</w:t>
+        <w:br/>
+        <w:t xml:space="preserve">   - El costo por penalización de ruptura asciende a $1170.00, representando el 92.5% del costo global del sistema.</w:t>
         <w:br/>
         <w:br/>
         <w:t>2. Análisis de Tiempos de Espera y Líneas de Espera:</w:t>
         <w:br/>
-        <w:t xml:space="preserve">   - Tiempo medio en cola (Wq): 2.172 s frente a un tiempo total en sistema (W) de 2.319 s.</w:t>
+        <w:t xml:space="preserve">   - Tiempo medio en cola (Wq): 0.537 s frente a un tiempo total en sistema (W) de 0.822 s.</w:t>
         <w:br/>
-        <w:t xml:space="preserve">   - El número medio de paquetes esperando en buffers (Lq) es de 52.23, lo cual indica que aproximadamente el 93.7% de los paquetes en la red se encuentran retenidos.</w:t>
+        <w:t xml:space="preserve">   - El número medio de paquetes esperando en buffers (Lq) es de 15.91, lo cual indica que aproximadamente el 65.5% de los paquetes en la red se encuentran retenidos.</w:t>
         <w:br/>
         <w:t xml:space="preserve">   - Little's Law Check: La relación entre L y W es consistente con la tasa de llegada efectiva procesada.</w:t>
         <w:br/>
         <w:br/>
-        <w:t>3. Evaluación del Modelo de Costos de Inventario:</w:t>
+        <w:t>3. Control de Flujo (s, Q) y Enrutamiento:</w:t>
         <w:br/>
-        <w:t xml:space="preserve">   - Costo de almacenamiento en RAM/Buffer: $306.26 (Holding Cost ponderado por Lq y tiempo).</w:t>
+        <w:t xml:space="preserve">   - Se autorizaron 569 lotes Q mediante señales de control de flujo; cada admisión consume saldo del lote vigente y el canal se cierra cuando se agota con la cola por encima de s.</w:t>
         <w:br/>
-        <w:t xml:space="preserve">   - Costo global consolidado del sistema: $25116.26.</w:t>
+        <w:t xml:space="preserve">   - Entregas en un egress distinto al destino asignado (desvíos de emergencia por falla de enlace): 0.</w:t>
         <w:br/>
-        <w:t xml:space="preserve">   - Trade-off observado: El costo dominante es la penalización por ruptura (Buffer Overflow).</w:t>
+        <w:br/>
+        <w:t>4. Evaluación del Modelo de Costos de Inventario:</w:t>
+        <w:br/>
+        <w:t xml:space="preserve">   - Costo de almacenamiento en RAM/Buffer: $95.51 (Holding Cost ponderado por Lq y tiempo).</w:t>
+        <w:br/>
+        <w:t xml:space="preserve">   - Costo global consolidado del sistema: $1265.51.</w:t>
+        <w:br/>
+        <w:t xml:space="preserve">   - Trade-off observado: El costo dominante es la penalización por ruptura (paquetes perdidos por overflow o rechazo del control de flujo).</w:t>
         <w:br/>
         <w:br/>
         <w:t>RECOMENDACIONES DE OPTIMIZACIÓN (3 ACCIONES CONCRETAS):</w:t>

</xml_diff>